<commit_message>
E02 - Library configuration
Also deleted a duplicate of E02.
</commit_message>
<xml_diff>
--- a/E02_Configuration/E02 - VS SFML Config.docx
+++ b/E02_Configuration/E02 - VS SFML Config.docx
@@ -1,6 +1,6 @@
 
 <file path=word/document.xml><?xml version="1.0" encoding="utf-8"?>
-<w:document xmlns:wpc="http://schemas.microsoft.com/office/word/2010/wordprocessingCanvas" xmlns:cx="http://schemas.microsoft.com/office/drawing/2014/chartex" xmlns:cx1="http://schemas.microsoft.com/office/drawing/2015/9/8/chartex" xmlns:cx2="http://schemas.microsoft.com/office/drawing/2015/10/21/chartex" xmlns:cx3="http://schemas.microsoft.com/office/drawing/2016/5/9/chartex" xmlns:cx4="http://schemas.microsoft.com/office/drawing/2016/5/10/chartex" xmlns:cx5="http://schemas.microsoft.com/office/drawing/2016/5/11/chartex" xmlns:cx6="http://schemas.microsoft.com/office/drawing/2016/5/12/chartex" xmlns:cx7="http://schemas.microsoft.com/office/drawing/2016/5/13/chartex" xmlns:cx8="http://schemas.microsoft.com/office/drawing/2016/5/14/chartex" xmlns:mc="http://schemas.openxmlformats.org/markup-compatibility/2006" xmlns:aink="http://schemas.microsoft.com/office/drawing/2016/ink" xmlns:am3d="http://schemas.microsoft.com/office/drawing/2017/model3d" xmlns:o="urn:schemas-microsoft-com:office:office" xmlns:oel="http://schemas.microsoft.com/office/2019/extlst" xmlns:r="http://schemas.openxmlformats.org/officeDocument/2006/relationships" xmlns:m="http://schemas.openxmlformats.org/officeDocument/2006/math" xmlns:v="urn:schemas-microsoft-com:vml" xmlns:wp14="http://schemas.microsoft.com/office/word/2010/wordprocessingDrawing" xmlns:wp="http://schemas.openxmlformats.org/drawingml/2006/wordprocessingDrawing" xmlns:w10="urn:schemas-microsoft-com:office:word" xmlns:w="http://schemas.openxmlformats.org/wordprocessingml/2006/main" xmlns:w14="http://schemas.microsoft.com/office/word/2010/wordml" xmlns:w15="http://schemas.microsoft.com/office/word/2012/wordml" xmlns:w16cex="http://schemas.microsoft.com/office/word/2018/wordml/cex" xmlns:w16cid="http://schemas.microsoft.com/office/word/2016/wordml/cid" xmlns:w16="http://schemas.microsoft.com/office/word/2018/wordml" xmlns:w16du="http://schemas.microsoft.com/office/word/2023/wordml/word16du" xmlns:w16sdtdh="http://schemas.microsoft.com/office/word/2020/wordml/sdtdatahash" xmlns:w16sdtfl="http://schemas.microsoft.com/office/word/2024/wordml/sdtformatlock" xmlns:w16se="http://schemas.microsoft.com/office/word/2015/wordml/symex" xmlns:wpg="http://schemas.microsoft.com/office/word/2010/wordprocessingGroup" xmlns:wpi="http://schemas.microsoft.com/office/word/2010/wordprocessingInk" xmlns:wne="http://schemas.microsoft.com/office/word/2006/wordml" xmlns:wps="http://schemas.microsoft.com/office/word/2010/wordprocessingShape" mc:Ignorable="w14 w15 w16se w16cid w16 w16cex w16sdtdh w16sdtfl w16du wp14">
+<w:document xmlns:wpc="http://schemas.microsoft.com/office/word/2010/wordprocessingCanvas" xmlns:cx="http://schemas.microsoft.com/office/drawing/2014/chartex" xmlns:cx1="http://schemas.microsoft.com/office/drawing/2015/9/8/chartex" xmlns:cx2="http://schemas.microsoft.com/office/drawing/2015/10/21/chartex" xmlns:cx3="http://schemas.microsoft.com/office/drawing/2016/5/9/chartex" xmlns:cx4="http://schemas.microsoft.com/office/drawing/2016/5/10/chartex" xmlns:cx5="http://schemas.microsoft.com/office/drawing/2016/5/11/chartex" xmlns:cx6="http://schemas.microsoft.com/office/drawing/2016/5/12/chartex" xmlns:cx7="http://schemas.microsoft.com/office/drawing/2016/5/13/chartex" xmlns:cx8="http://schemas.microsoft.com/office/drawing/2016/5/14/chartex" xmlns:mc="http://schemas.openxmlformats.org/markup-compatibility/2006" xmlns:aink="http://schemas.microsoft.com/office/drawing/2016/ink" xmlns:am3d="http://schemas.microsoft.com/office/drawing/2017/model3d" xmlns:o="urn:schemas-microsoft-com:office:office" xmlns:r="http://schemas.openxmlformats.org/officeDocument/2006/relationships" xmlns:m="http://schemas.openxmlformats.org/officeDocument/2006/math" xmlns:v="urn:schemas-microsoft-com:vml" xmlns:wp14="http://schemas.microsoft.com/office/word/2010/wordprocessingDrawing" xmlns:wp="http://schemas.openxmlformats.org/drawingml/2006/wordprocessingDrawing" xmlns:w10="urn:schemas-microsoft-com:office:word" xmlns:w="http://schemas.openxmlformats.org/wordprocessingml/2006/main" xmlns:w14="http://schemas.microsoft.com/office/word/2010/wordml" xmlns:w15="http://schemas.microsoft.com/office/word/2012/wordml" xmlns:w16cex="http://schemas.microsoft.com/office/word/2018/wordml/cex" xmlns:w16cid="http://schemas.microsoft.com/office/word/2016/wordml/cid" xmlns:w16="http://schemas.microsoft.com/office/word/2018/wordml" xmlns:w16sdtdh="http://schemas.microsoft.com/office/word/2020/wordml/sdtdatahash" xmlns:w16se="http://schemas.microsoft.com/office/word/2015/wordml/symex" xmlns:wpg="http://schemas.microsoft.com/office/word/2010/wordprocessingGroup" xmlns:wpi="http://schemas.microsoft.com/office/word/2010/wordprocessingInk" xmlns:wne="http://schemas.microsoft.com/office/word/2006/wordml" xmlns:wps="http://schemas.microsoft.com/office/word/2010/wordprocessingShape" mc:Ignorable="w14 w15 w16se w16cid w16 w16cex w16sdtdh wp14">
   <w:body>
     <w:p>
       <w:pPr>
@@ -60,22 +60,7 @@
     </w:p>
     <w:p>
       <w:r>
-        <w:t xml:space="preserve">Deliverable: </w:t>
-      </w:r>
-      <w:r>
-        <w:t xml:space="preserve">zipped project </w:t>
-      </w:r>
-      <w:r>
-        <w:t>file (</w:t>
-      </w:r>
-      <w:r>
-        <w:t>not the entire solution</w:t>
-      </w:r>
-      <w:r>
-        <w:t xml:space="preserve">, </w:t>
-      </w:r>
-      <w:r>
-        <w:t>the project is everything at the level of the .vcxproj files, a solution is everything at the level of .sln)</w:t>
+        <w:t>Deliverable: zipped project file (not the entire solution, the project is everything at the level of the .vcxproj files, a solution is everything at the level of .sln)</w:t>
       </w:r>
     </w:p>
     <w:p>
@@ -1523,7 +1508,19 @@
         <w:ind w:left="720"/>
       </w:pPr>
       <w:r>
-        <w:t xml:space="preserve">This will tell our application what files we are using, there is </w:t>
+        <w:t>This will tell our application what files we are using</w:t>
+      </w:r>
+      <w:r>
+        <w:t>.</w:t>
+      </w:r>
+      <w:r>
+        <w:t xml:space="preserve"> </w:t>
+      </w:r>
+      <w:r>
+        <w:t>T</w:t>
+      </w:r>
+      <w:r>
+        <w:t xml:space="preserve">here is </w:t>
       </w:r>
       <w:r>
         <w:t>a completely</w:t>
@@ -1532,7 +1529,13 @@
         <w:t xml:space="preserve"> different set of files for a release version</w:t>
       </w:r>
       <w:r>
-        <w:t>, and our provided solution is already configured for us, while necessary if we want to compile to distribute the .exe of our application, it is not needed for this exercise. Many libraries use the -d or _d at the end of a file to indicate that is a debug version of their libraries.</w:t>
+        <w:t>, and our provided solution is already configured for us</w:t>
+      </w:r>
+      <w:r>
+        <w:t>.</w:t>
+      </w:r>
+      <w:r>
+        <w:t xml:space="preserve"> while necessary if we want to compile to distribute the .exe of our application, it is not needed for this exercise. Many libraries use the -d or _d at the end of a file to indicate that is a debug version of their libraries.</w:t>
       </w:r>
     </w:p>
     <w:p>
@@ -1824,7 +1827,7 @@
 </file>
 
 <file path=word/numbering.xml><?xml version="1.0" encoding="utf-8"?>
-<w:numbering xmlns:wpc="http://schemas.microsoft.com/office/word/2010/wordprocessingCanvas" xmlns:cx="http://schemas.microsoft.com/office/drawing/2014/chartex" xmlns:cx1="http://schemas.microsoft.com/office/drawing/2015/9/8/chartex" xmlns:cx2="http://schemas.microsoft.com/office/drawing/2015/10/21/chartex" xmlns:cx3="http://schemas.microsoft.com/office/drawing/2016/5/9/chartex" xmlns:cx4="http://schemas.microsoft.com/office/drawing/2016/5/10/chartex" xmlns:cx5="http://schemas.microsoft.com/office/drawing/2016/5/11/chartex" xmlns:cx6="http://schemas.microsoft.com/office/drawing/2016/5/12/chartex" xmlns:cx7="http://schemas.microsoft.com/office/drawing/2016/5/13/chartex" xmlns:cx8="http://schemas.microsoft.com/office/drawing/2016/5/14/chartex" xmlns:mc="http://schemas.openxmlformats.org/markup-compatibility/2006" xmlns:aink="http://schemas.microsoft.com/office/drawing/2016/ink" xmlns:am3d="http://schemas.microsoft.com/office/drawing/2017/model3d" xmlns:o="urn:schemas-microsoft-com:office:office" xmlns:oel="http://schemas.microsoft.com/office/2019/extlst" xmlns:r="http://schemas.openxmlformats.org/officeDocument/2006/relationships" xmlns:m="http://schemas.openxmlformats.org/officeDocument/2006/math" xmlns:v="urn:schemas-microsoft-com:vml" xmlns:wp14="http://schemas.microsoft.com/office/word/2010/wordprocessingDrawing" xmlns:wp="http://schemas.openxmlformats.org/drawingml/2006/wordprocessingDrawing" xmlns:w10="urn:schemas-microsoft-com:office:word" xmlns:w="http://schemas.openxmlformats.org/wordprocessingml/2006/main" xmlns:w14="http://schemas.microsoft.com/office/word/2010/wordml" xmlns:w15="http://schemas.microsoft.com/office/word/2012/wordml" xmlns:w16cex="http://schemas.microsoft.com/office/word/2018/wordml/cex" xmlns:w16cid="http://schemas.microsoft.com/office/word/2016/wordml/cid" xmlns:w16="http://schemas.microsoft.com/office/word/2018/wordml" xmlns:w16du="http://schemas.microsoft.com/office/word/2023/wordml/word16du" xmlns:w16sdtdh="http://schemas.microsoft.com/office/word/2020/wordml/sdtdatahash" xmlns:w16sdtfl="http://schemas.microsoft.com/office/word/2024/wordml/sdtformatlock" xmlns:w16se="http://schemas.microsoft.com/office/word/2015/wordml/symex" xmlns:wpg="http://schemas.microsoft.com/office/word/2010/wordprocessingGroup" xmlns:wpi="http://schemas.microsoft.com/office/word/2010/wordprocessingInk" xmlns:wne="http://schemas.microsoft.com/office/word/2006/wordml" xmlns:wps="http://schemas.microsoft.com/office/word/2010/wordprocessingShape" mc:Ignorable="w14 w15 w16se w16cid w16 w16cex w16sdtdh w16sdtfl w16du wp14">
+<w:numbering xmlns:wpc="http://schemas.microsoft.com/office/word/2010/wordprocessingCanvas" xmlns:cx="http://schemas.microsoft.com/office/drawing/2014/chartex" xmlns:cx1="http://schemas.microsoft.com/office/drawing/2015/9/8/chartex" xmlns:cx2="http://schemas.microsoft.com/office/drawing/2015/10/21/chartex" xmlns:cx3="http://schemas.microsoft.com/office/drawing/2016/5/9/chartex" xmlns:cx4="http://schemas.microsoft.com/office/drawing/2016/5/10/chartex" xmlns:cx5="http://schemas.microsoft.com/office/drawing/2016/5/11/chartex" xmlns:cx6="http://schemas.microsoft.com/office/drawing/2016/5/12/chartex" xmlns:cx7="http://schemas.microsoft.com/office/drawing/2016/5/13/chartex" xmlns:cx8="http://schemas.microsoft.com/office/drawing/2016/5/14/chartex" xmlns:mc="http://schemas.openxmlformats.org/markup-compatibility/2006" xmlns:aink="http://schemas.microsoft.com/office/drawing/2016/ink" xmlns:am3d="http://schemas.microsoft.com/office/drawing/2017/model3d" xmlns:o="urn:schemas-microsoft-com:office:office" xmlns:r="http://schemas.openxmlformats.org/officeDocument/2006/relationships" xmlns:m="http://schemas.openxmlformats.org/officeDocument/2006/math" xmlns:v="urn:schemas-microsoft-com:vml" xmlns:wp14="http://schemas.microsoft.com/office/word/2010/wordprocessingDrawing" xmlns:wp="http://schemas.openxmlformats.org/drawingml/2006/wordprocessingDrawing" xmlns:w10="urn:schemas-microsoft-com:office:word" xmlns:w="http://schemas.openxmlformats.org/wordprocessingml/2006/main" xmlns:w14="http://schemas.microsoft.com/office/word/2010/wordml" xmlns:w15="http://schemas.microsoft.com/office/word/2012/wordml" xmlns:w16cex="http://schemas.microsoft.com/office/word/2018/wordml/cex" xmlns:w16cid="http://schemas.microsoft.com/office/word/2016/wordml/cid" xmlns:w16="http://schemas.microsoft.com/office/word/2018/wordml" xmlns:w16sdtdh="http://schemas.microsoft.com/office/word/2020/wordml/sdtdatahash" xmlns:w16se="http://schemas.microsoft.com/office/word/2015/wordml/symex" xmlns:wpg="http://schemas.microsoft.com/office/word/2010/wordprocessingGroup" xmlns:wpi="http://schemas.microsoft.com/office/word/2010/wordprocessingInk" xmlns:wne="http://schemas.microsoft.com/office/word/2006/wordml" xmlns:wps="http://schemas.microsoft.com/office/word/2010/wordprocessingShape" mc:Ignorable="w14 w15 w16se w16cid w16 w16cex w16sdtdh wp14">
   <w:abstractNum w:abstractNumId="0" w15:restartNumberingAfterBreak="0">
     <w:nsid w:val="05441F5A"/>
     <w:multiLevelType w:val="hybridMultilevel"/>
@@ -3738,46 +3741,46 @@
       </w:rPr>
     </w:lvl>
   </w:abstractNum>
-  <w:num w:numId="1" w16cid:durableId="132915145">
+  <w:num w:numId="1">
     <w:abstractNumId w:val="11"/>
   </w:num>
-  <w:num w:numId="2" w16cid:durableId="357632310">
+  <w:num w:numId="2">
     <w:abstractNumId w:val="4"/>
   </w:num>
-  <w:num w:numId="3" w16cid:durableId="943075825">
+  <w:num w:numId="3">
     <w:abstractNumId w:val="9"/>
   </w:num>
-  <w:num w:numId="4" w16cid:durableId="745809997">
+  <w:num w:numId="4">
     <w:abstractNumId w:val="16"/>
   </w:num>
-  <w:num w:numId="5" w16cid:durableId="1778017212">
+  <w:num w:numId="5">
     <w:abstractNumId w:val="13"/>
   </w:num>
-  <w:num w:numId="6" w16cid:durableId="134756974">
+  <w:num w:numId="6">
     <w:abstractNumId w:val="2"/>
   </w:num>
-  <w:num w:numId="7" w16cid:durableId="354814821">
+  <w:num w:numId="7">
     <w:abstractNumId w:val="7"/>
   </w:num>
-  <w:num w:numId="8" w16cid:durableId="33119347">
+  <w:num w:numId="8">
     <w:abstractNumId w:val="3"/>
   </w:num>
-  <w:num w:numId="9" w16cid:durableId="1140610115">
+  <w:num w:numId="9">
     <w:abstractNumId w:val="12"/>
   </w:num>
-  <w:num w:numId="10" w16cid:durableId="185753325">
+  <w:num w:numId="10">
     <w:abstractNumId w:val="5"/>
   </w:num>
-  <w:num w:numId="11" w16cid:durableId="1901137338">
+  <w:num w:numId="11">
     <w:abstractNumId w:val="0"/>
   </w:num>
-  <w:num w:numId="12" w16cid:durableId="1091699527">
+  <w:num w:numId="12">
     <w:abstractNumId w:val="10"/>
   </w:num>
-  <w:num w:numId="13" w16cid:durableId="963192604">
+  <w:num w:numId="13">
     <w:abstractNumId w:val="1"/>
   </w:num>
-  <w:num w:numId="14" w16cid:durableId="1974600403">
+  <w:num w:numId="14">
     <w:abstractNumId w:val="8"/>
     <w:lvlOverride w:ilvl="0">
       <w:startOverride w:val="1"/>
@@ -3807,20 +3810,20 @@
       <w:startOverride w:val="1"/>
     </w:lvlOverride>
   </w:num>
-  <w:num w:numId="15" w16cid:durableId="1488588205">
+  <w:num w:numId="15">
     <w:abstractNumId w:val="14"/>
   </w:num>
-  <w:num w:numId="16" w16cid:durableId="832180313">
+  <w:num w:numId="16">
     <w:abstractNumId w:val="6"/>
   </w:num>
-  <w:num w:numId="17" w16cid:durableId="556161014">
+  <w:num w:numId="17">
     <w:abstractNumId w:val="15"/>
   </w:num>
 </w:numbering>
 </file>
 
 <file path=word/styles.xml><?xml version="1.0" encoding="utf-8"?>
-<w:styles xmlns:mc="http://schemas.openxmlformats.org/markup-compatibility/2006" xmlns:r="http://schemas.openxmlformats.org/officeDocument/2006/relationships" xmlns:w="http://schemas.openxmlformats.org/wordprocessingml/2006/main" xmlns:w14="http://schemas.microsoft.com/office/word/2010/wordml" xmlns:w15="http://schemas.microsoft.com/office/word/2012/wordml" xmlns:w16cex="http://schemas.microsoft.com/office/word/2018/wordml/cex" xmlns:w16cid="http://schemas.microsoft.com/office/word/2016/wordml/cid" xmlns:w16="http://schemas.microsoft.com/office/word/2018/wordml" xmlns:w16du="http://schemas.microsoft.com/office/word/2023/wordml/word16du" xmlns:w16sdtdh="http://schemas.microsoft.com/office/word/2020/wordml/sdtdatahash" xmlns:w16sdtfl="http://schemas.microsoft.com/office/word/2024/wordml/sdtformatlock" xmlns:w16se="http://schemas.microsoft.com/office/word/2015/wordml/symex" mc:Ignorable="w14 w15 w16se w16cid w16 w16cex w16sdtdh w16sdtfl w16du">
+<w:styles xmlns:mc="http://schemas.openxmlformats.org/markup-compatibility/2006" xmlns:r="http://schemas.openxmlformats.org/officeDocument/2006/relationships" xmlns:w="http://schemas.openxmlformats.org/wordprocessingml/2006/main" xmlns:w14="http://schemas.microsoft.com/office/word/2010/wordml" xmlns:w15="http://schemas.microsoft.com/office/word/2012/wordml" xmlns:w16cex="http://schemas.microsoft.com/office/word/2018/wordml/cex" xmlns:w16cid="http://schemas.microsoft.com/office/word/2016/wordml/cid" xmlns:w16="http://schemas.microsoft.com/office/word/2018/wordml" xmlns:w16sdtdh="http://schemas.microsoft.com/office/word/2020/wordml/sdtdatahash" xmlns:w16se="http://schemas.microsoft.com/office/word/2015/wordml/symex" mc:Ignorable="w14 w15 w16se w16cid w16 w16cex w16sdtdh">
   <w:docDefaults>
     <w:rPrDefault>
       <w:rPr>

</xml_diff>